<commit_message>
Word guides v22.50 / v22.52: loyalty figures taken out like the older guides
The access build scrubbed the generated guides that existed when it was
built (up to v22.48); v22.50 and v22.52 came later and still held the
loyalty opening figures. Same substitutions (scrub_docx). sensitive-areas
"Repo" case now passes.

Co-Authored-By: Claude Opus 5.5 <noreply@anthropic.com>
Claude-Session: https://claude.ai/code/session_01T49gnSNZq31rPRt1vHk4Rc
</commit_message>
<xml_diff>
--- a/nexidoc/Nexi_User_Guide_v22.50.docx
+++ b/nexidoc/Nexi_User_Guide_v22.50.docx
@@ -10081,7 +10081,7 @@
     </w:p>
     <w:p>
       <w:r>
-        <w:t>HR card: for an office employee paid from the Monthly Basic, the Daily Rate Override box is greyed out with “Not used — pay comes from the Monthly Basic …” (it was ignored in silence). New box “Fixed EWT per cut-off” (accounting only): the exact company-paid BIR for a management member — Dr Amy ₱2,604.17 and Eyal ₱4,270.83 were moved onto it once from the code, pay unchanged; a new management member is set here.</w:t>
+        <w:t>HR card: for an office employee paid from the Monthly Basic, the Daily Rate Override box is greyed out with “Not used — pay comes from the Monthly Basic …” (it was ignored in silence). New box “Fixed EWT per cut-off” (accounting only): the exact company-paid BIR for a management member — the management members’ amounts were moved onto it once from the code, pay unchanged; a new management member is set here.</w:t>
       </w:r>
     </w:p>
     <w:p>
@@ -12433,7 +12433,7 @@
     </w:p>
     <w:p>
       <w:r>
-        <w:t>Every allowance row has a unit: per MONTH, PER DAY worked, or — since v21.23 — per MONTH if no missing day (an attendance incentive: paid whole in the cut-off that closes the calendar month, only when the month had no unauthorised absence; lates and approved leave do not break it; the payslip line says why it was or was not paid). The editors also warn when the same allowance row is on a card twice — Jomel’s Meal ₱2,000 sat there three times and paid ₱3,000 a cut-off. Since v21.24 an identical row (same purpose, unit, amount and taxable flag) is counted once by payroll whatever the card holds, and opening the card or the 💰 Allowances editor shows it as one row with a toast; press Save to keep the card clean, then regenerate the run. Per MONTH is prorated; PER DAY is multiplied by every day the person worked, with no ceiling. A ₱2,000 figure meant as a month, typed into a row left on PER DAY, paid ₱22,000 in one office cut-off.</w:t>
+        <w:t>Every allowance row has a unit: per MONTH, PER DAY worked, or — since v21.23 — per MONTH if no missing day (an attendance incentive: paid whole in the cut-off that closes the calendar month, only when the month had no unauthorised absence; lates and approved leave do not break it; the payslip line says why it was or was not paid). The editors also warn when the same allowance row is on a card twice — one card carried the same meal allowance three times and paid it three times a cut-off. Since v21.24 an identical row (same purpose, unit, amount and taxable flag) is counted once by payroll whatever the card holds, and opening the card or the 💰 Allowances editor shows it as one row with a toast; press Save to keep the card clean, then regenerate the run. Per MONTH is prorated; PER DAY is multiplied by every day the person worked, with no ceiling. A ₱2,000 figure meant as a month, typed into a row left on PER DAY, paid ₱22,000 in one office cut-off.</w:t>
       </w:r>
     </w:p>
     <w:p>
@@ -15224,7 +15224,7 @@
     </w:p>
     <w:p>
       <w:r>
-        <w:t>Loyalty Savings and every payroll screen (also the ones opened from Accounting) are visible ONLY to the System Admin, Jinky, Eyal and Dr Amy. Every other user — also Accounting users such as Joshane, and secondary admins — gets a 🔒 message and no employee amounts. Access overrides in Administration cannot open it for anyone else.</w:t>
+        <w:t>Loyalty Savings and every payroll screen (also the ones opened from Accounting) are visible ONLY to the System Admin, Jinky, Eyal and Dr Amy. Every other user — also other Accounting users and secondary admins — gets a 🔒 message and no employee amounts. Access overrides in Administration cannot open it for anyone else.</w:t>
       </w:r>
     </w:p>
     <w:p>
@@ -15242,7 +15242,7 @@
     </w:p>
     <w:p>
       <w:r>
-        <w:t>Every month the company sets aside a fixed amount per member (the monthly entitlement — ₱10,000 / ₱10,000 / ₱2,000 today). The amounts are remitted together to BDO by voucher and check, and BDO buys units of the Short Term Fund at that day’s NAVPU (the confirmation, COP, states the NAVPU and the units). Each employee owns a share of every remittance equal to their contribution ÷ the remittance, so they own that share of the units bought. Worth today = units × the latest NAVPU; interest = worth − contributions. The value moves with the NAVPU and can go down in a period (Mar→Apr 2026 did).</w:t>
+        <w:t>Every month the company sets aside a fixed amount per member (the monthly entitlement on each member’s HR card). The amounts are remitted together to BDO by voucher and check, and BDO buys units of the Short Term Fund at that day’s NAVPU (the confirmation, COP, states the NAVPU and the units). Each employee owns a share of every remittance equal to their contribution ÷ the remittance, so they own that share of the units bought. Worth today = units × the latest NAVPU; interest = worth − contributions. The value moves with the NAVPU and can go down in a period (Mar→Apr 2026 did).</w:t>
       </w:r>
     </w:p>
     <w:p>
@@ -15310,7 +15310,7 @@
     </w:p>
     <w:p>
       <w:r>
-        <w:t>The first open seeds the 28-Sep-2026 BDO audit workbook: Aug-2025 → Jun-2026, 10 remittances, ₱219,000 remitted, 1,689.1159 units, NAVPU 132.0663 on 14-Sep-2026, ₱89,000 outstanding to Sep-2026 (Jul–Sep unfunded for all three, Taladtad short in Feb–Apr). Correct anything from the vouchers; the workbook stays the audit trail.</w:t>
+        <w:t>The plan’s figures live in the synced loyalty store (they were entered from the BDO audit workbook of 28-Sep-2026); nothing is built into the page. Correct anything from the vouchers; the workbook stays the audit trail.</w:t>
       </w:r>
     </w:p>
     <w:p>

</xml_diff>